<commit_message>
Pack 25.6: act/invoice number from period month
</commit_message>
<xml_diff>
--- a/templates/docx/invoice_template.docx
+++ b/templates/docx/invoice_template.docx
@@ -1,6 +1,6 @@
 
 <file path=word/document.xml><?xml version="1.0" encoding="utf-8"?>
-<w:document xmlns:wpc="http://schemas.microsoft.com/office/word/2010/wordprocessingCanvas" xmlns:cx="http://schemas.microsoft.com/office/drawing/2014/chartex" xmlns:cx1="http://schemas.microsoft.com/office/drawing/2015/9/8/chartex" xmlns:cx2="http://schemas.microsoft.com/office/drawing/2015/10/21/chartex" xmlns:cx3="http://schemas.microsoft.com/office/drawing/2016/5/9/chartex" xmlns:cx4="http://schemas.microsoft.com/office/drawing/2016/5/10/chartex" xmlns:cx5="http://schemas.microsoft.com/office/drawing/2016/5/11/chartex" xmlns:cx6="http://schemas.microsoft.com/office/drawing/2016/5/12/chartex" xmlns:cx7="http://schemas.microsoft.com/office/drawing/2016/5/13/chartex" xmlns:cx8="http://schemas.microsoft.com/office/drawing/2016/5/14/chartex" xmlns:mc="http://schemas.openxmlformats.org/markup-compatibility/2006" xmlns:aink="http://schemas.microsoft.com/office/drawing/2016/ink" xmlns:am3d="http://schemas.microsoft.com/office/drawing/2017/model3d" xmlns:o="urn:schemas-microsoft-com:office:office" xmlns:oel="http://schemas.microsoft.com/office/2019/extlst" xmlns:r="http://schemas.openxmlformats.org/officeDocument/2006/relationships" xmlns:m="http://schemas.openxmlformats.org/officeDocument/2006/math" xmlns:v="urn:schemas-microsoft-com:vml" xmlns:wp14="http://schemas.microsoft.com/office/word/2010/wordprocessingDrawing" xmlns:wp="http://schemas.openxmlformats.org/drawingml/2006/wordprocessingDrawing" xmlns:w10="urn:schemas-microsoft-com:office:word" xmlns:w="http://schemas.openxmlformats.org/wordprocessingml/2006/main" xmlns:w14="http://schemas.microsoft.com/office/word/2010/wordml" xmlns:w15="http://schemas.microsoft.com/office/word/2012/wordml" xmlns:w16cex="http://schemas.microsoft.com/office/word/2018/wordml/cex" xmlns:w16cid="http://schemas.microsoft.com/office/word/2016/wordml/cid" xmlns:w16="http://schemas.microsoft.com/office/word/2018/wordml" xmlns:w16du="http://schemas.microsoft.com/office/word/2023/wordml/word16du" xmlns:w16sdtdh="http://schemas.microsoft.com/office/word/2020/wordml/sdtdatahash" xmlns:w16sdtfl="http://schemas.microsoft.com/office/word/2024/wordml/sdtformatlock" xmlns:w16se="http://schemas.microsoft.com/office/word/2015/wordml/symex" xmlns:wpg="http://schemas.microsoft.com/office/word/2010/wordprocessingGroup" xmlns:wpi="http://schemas.microsoft.com/office/word/2010/wordprocessingInk" xmlns:wne="http://schemas.microsoft.com/office/word/2006/wordml" xmlns:wps="http://schemas.microsoft.com/office/word/2010/wordprocessingShape" mc:Ignorable="w14 w15 w16se w16cid w16 w16cex w16sdtdh w16sdtfl w16du wp14">
+<w:document xmlns:wpc="http://schemas.microsoft.com/office/word/2010/wordprocessingCanvas" xmlns:cx="http://schemas.microsoft.com/office/drawing/2014/chartex" xmlns:cx1="http://schemas.microsoft.com/office/drawing/2015/9/8/chartex" xmlns:cx2="http://schemas.microsoft.com/office/drawing/2015/10/21/chartex" xmlns:cx3="http://schemas.microsoft.com/office/drawing/2016/5/9/chartex" xmlns:cx4="http://schemas.microsoft.com/office/drawing/2016/5/10/chartex" xmlns:cx5="http://schemas.microsoft.com/office/drawing/2016/5/11/chartex" xmlns:cx6="http://schemas.microsoft.com/office/drawing/2016/5/12/chartex" xmlns:cx7="http://schemas.microsoft.com/office/drawing/2016/5/13/chartex" xmlns:cx8="http://schemas.microsoft.com/office/drawing/2016/5/14/chartex" xmlns:mc="http://schemas.openxmlformats.org/markup-compatibility/2006" xmlns:aink="http://schemas.microsoft.com/office/drawing/2016/ink" xmlns:am3d="http://schemas.microsoft.com/office/drawing/2017/model3d" xmlns:o="urn:schemas-microsoft-com:office:office" xmlns:r="http://schemas.openxmlformats.org/officeDocument/2006/relationships" xmlns:m="http://schemas.openxmlformats.org/officeDocument/2006/math" xmlns:v="urn:schemas-microsoft-com:vml" xmlns:wp14="http://schemas.microsoft.com/office/word/2010/wordprocessingDrawing" xmlns:wp="http://schemas.openxmlformats.org/drawingml/2006/wordprocessingDrawing" xmlns:w10="urn:schemas-microsoft-com:office:word" xmlns:w="http://schemas.openxmlformats.org/wordprocessingml/2006/main" xmlns:w14="http://schemas.microsoft.com/office/word/2010/wordml" xmlns:w15="http://schemas.microsoft.com/office/word/2012/wordml" xmlns:w16cid="http://schemas.microsoft.com/office/word/2016/wordml/cid" xmlns:w16se="http://schemas.microsoft.com/office/word/2015/wordml/symex" xmlns:wpg="http://schemas.microsoft.com/office/word/2010/wordprocessingGroup" xmlns:wpi="http://schemas.microsoft.com/office/word/2010/wordprocessingInk" xmlns:wne="http://schemas.microsoft.com/office/word/2006/wordml" xmlns:wps="http://schemas.microsoft.com/office/word/2010/wordprocessingShape" mc:Ignorable="w14 w15 w16se w16cid wp14">
   <w:body>
     <w:p>
       <w:pPr>
@@ -12,16 +12,19 @@
           <w:bCs/>
           <w:sz w:val="24"/>
           <w:szCs w:val="24"/>
+          <w:lang w:val="en-US"/>
         </w:rPr>
       </w:pPr>
+      <w:proofErr w:type="gramStart"/>
       <w:r>
         <w:rPr>
           <w:b/>
           <w:bCs/>
           <w:sz w:val="24"/>
           <w:szCs w:val="24"/>
-        </w:rPr>
-        <w:t>{{ applicant.full_name_native }}</w:t>
+          <w:lang w:val="en-US"/>
+        </w:rPr>
+        <w:t xml:space="preserve">{{ </w:t>
       </w:r>
       <w:proofErr w:type="spellStart"/>
       <w:r>
@@ -30,18 +33,69 @@
           <w:bCs/>
           <w:sz w:val="24"/>
           <w:szCs w:val="24"/>
-        </w:rPr>
+          <w:lang w:val="en-US"/>
+        </w:rPr>
+        <w:t>applicant</w:t>
+      </w:r>
+      <w:proofErr w:type="gramEnd"/>
+      <w:r>
+        <w:rPr>
+          <w:b/>
+          <w:bCs/>
+          <w:sz w:val="24"/>
+          <w:szCs w:val="24"/>
+          <w:lang w:val="en-US"/>
+        </w:rPr>
+        <w:t>.full_name_native</w:t>
       </w:r>
       <w:proofErr w:type="spellEnd"/>
+      <w:r>
+        <w:rPr>
+          <w:b/>
+          <w:bCs/>
+          <w:sz w:val="24"/>
+          <w:szCs w:val="24"/>
+          <w:lang w:val="en-US"/>
+        </w:rPr>
+        <w:t xml:space="preserve"> }}</w:t>
+      </w:r>
     </w:p>
     <w:p>
       <w:pPr>
         <w:pStyle w:val="a3"/>
         <w:spacing w:after="54"/>
         <w:ind w:left="63"/>
+        <w:rPr>
+          <w:lang w:val="en-US"/>
+        </w:rPr>
       </w:pPr>
-      <w:r>
-        <w:t>{{ applicant.home_address }}</w:t>
+      <w:proofErr w:type="gramStart"/>
+      <w:r>
+        <w:rPr>
+          <w:lang w:val="en-US"/>
+        </w:rPr>
+        <w:t xml:space="preserve">{{ </w:t>
+      </w:r>
+      <w:proofErr w:type="spellStart"/>
+      <w:r>
+        <w:rPr>
+          <w:lang w:val="en-US"/>
+        </w:rPr>
+        <w:t>applicant</w:t>
+      </w:r>
+      <w:proofErr w:type="gramEnd"/>
+      <w:r>
+        <w:rPr>
+          <w:lang w:val="en-US"/>
+        </w:rPr>
+        <w:t>.home_address</w:t>
+      </w:r>
+      <w:proofErr w:type="spellEnd"/>
+      <w:r>
+        <w:rPr>
+          <w:lang w:val="en-US"/>
+        </w:rPr>
+        <w:t xml:space="preserve"> }}</w:t>
       </w:r>
     </w:p>
     <w:p>
@@ -49,6 +103,9 @@
         <w:pStyle w:val="a3"/>
         <w:spacing w:after="54"/>
         <w:ind w:left="63"/>
+        <w:rPr>
+          <w:lang w:val="en-US"/>
+        </w:rPr>
       </w:pPr>
     </w:p>
     <w:p>
@@ -114,33 +171,14 @@
                 <w:sz w:val="20"/>
               </w:rPr>
               <w:t>ИНН {{ applicant.inn }}</w:t>
+            </w:r>
+            <w:r>
+              <w:rPr>
+                <w:color w:val="666666"/>
+                <w:sz w:val="20"/>
+              </w:rPr>
               <w:tab/>
               <w:t>КПП</w:t>
-            </w:r>
-            <w:r>
-              <w:rPr>
-                <w:color w:val="666666"/>
-                <w:spacing w:val="-23"/>
-                <w:sz w:val="20"/>
-              </w:rPr>
-            </w:r>
-            <w:r>
-              <w:rPr>
-                <w:spacing w:val="-2"/>
-                <w:sz w:val="20"/>
-              </w:rPr>
-            </w:r>
-            <w:r>
-              <w:rPr>
-                <w:sz w:val="20"/>
-              </w:rPr>
-            </w:r>
-            <w:r>
-              <w:rPr>
-                <w:color w:val="666666"/>
-                <w:spacing w:val="-5"/>
-                <w:sz w:val="20"/>
-              </w:rPr>
             </w:r>
           </w:p>
         </w:tc>
@@ -255,6 +293,7 @@
               <w:ind w:left="80"/>
               <w:rPr>
                 <w:sz w:val="20"/>
+                <w:lang w:val="en-US"/>
               </w:rPr>
             </w:pPr>
             <w:r>
@@ -273,21 +312,41 @@
               <w:ind w:left="80"/>
               <w:rPr>
                 <w:sz w:val="20"/>
-              </w:rPr>
-            </w:pPr>
-            <w:r>
-              <w:rPr>
-                <w:sz w:val="20"/>
-              </w:rPr>
-              <w:t>{{ applicant.full_name_native }}</w:t>
+                <w:lang w:val="en-US"/>
+              </w:rPr>
+            </w:pPr>
+            <w:proofErr w:type="gramStart"/>
+            <w:r>
+              <w:rPr>
+                <w:sz w:val="20"/>
+                <w:lang w:val="en-US"/>
+              </w:rPr>
+              <w:t xml:space="preserve">{{ </w:t>
             </w:r>
             <w:proofErr w:type="spellStart"/>
             <w:r>
               <w:rPr>
                 <w:sz w:val="20"/>
-              </w:rPr>
+                <w:lang w:val="en-US"/>
+              </w:rPr>
+              <w:t>applicant</w:t>
+            </w:r>
+            <w:proofErr w:type="gramEnd"/>
+            <w:r>
+              <w:rPr>
+                <w:sz w:val="20"/>
+                <w:lang w:val="en-US"/>
+              </w:rPr>
+              <w:t>.full_name_native</w:t>
             </w:r>
             <w:proofErr w:type="spellEnd"/>
+            <w:r>
+              <w:rPr>
+                <w:sz w:val="20"/>
+                <w:lang w:val="en-US"/>
+              </w:rPr>
+              <w:t xml:space="preserve"> }}</w:t>
+            </w:r>
           </w:p>
         </w:tc>
         <w:tc>
@@ -303,6 +362,7 @@
               <w:rPr>
                 <w:sz w:val="2"/>
                 <w:szCs w:val="2"/>
+                <w:lang w:val="en-US"/>
               </w:rPr>
             </w:pPr>
           </w:p>
@@ -320,6 +380,7 @@
               <w:rPr>
                 <w:sz w:val="2"/>
                 <w:szCs w:val="2"/>
+                <w:lang w:val="en-US"/>
               </w:rPr>
             </w:pPr>
           </w:p>
@@ -341,6 +402,7 @@
               <w:ind w:left="80" w:right="1846"/>
               <w:rPr>
                 <w:sz w:val="20"/>
+                <w:lang w:val="en-US"/>
               </w:rPr>
             </w:pPr>
             <w:r>
@@ -355,6 +417,7 @@
                 <w:color w:val="666666"/>
                 <w:spacing w:val="-16"/>
                 <w:sz w:val="20"/>
+                <w:lang w:val="en-US"/>
               </w:rPr>
               <w:t xml:space="preserve"> </w:t>
             </w:r>
@@ -363,17 +426,27 @@
                 <w:color w:val="666666"/>
                 <w:sz w:val="20"/>
               </w:rPr>
-              <w:t xml:space="preserve">получателя </w:t>
-            </w:r>
-            <w:r>
-              <w:rPr>
-                <w:sz w:val="20"/>
+              <w:t>получателя</w:t>
+            </w:r>
+            <w:r>
+              <w:rPr>
+                <w:color w:val="666666"/>
+                <w:sz w:val="20"/>
+                <w:lang w:val="en-US"/>
               </w:rPr>
               <w:t xml:space="preserve"> </w:t>
             </w:r>
             <w:r>
               <w:rPr>
                 <w:sz w:val="20"/>
+                <w:lang w:val="en-US"/>
+              </w:rPr>
+              <w:t xml:space="preserve"> </w:t>
+            </w:r>
+            <w:r>
+              <w:rPr>
+                <w:sz w:val="20"/>
+                <w:lang w:val="en-US"/>
               </w:rPr>
               <w:t xml:space="preserve"> </w:t>
             </w:r>
@@ -385,38 +458,40 @@
               <w:ind w:left="80" w:right="1846"/>
               <w:rPr>
                 <w:sz w:val="20"/>
-              </w:rPr>
-            </w:pPr>
-            <w:r>
-              <w:rPr>
-                <w:sz w:val="20"/>
-              </w:rPr>
-              <w:t>{{ applicant.bank_name }}</w:t>
-            </w:r>
-            <w:r>
-              <w:rPr>
-                <w:sz w:val="20"/>
-              </w:rPr>
-            </w:r>
-            <w:r>
-              <w:rPr>
-                <w:sz w:val="20"/>
-              </w:rPr>
-            </w:r>
-            <w:r>
-              <w:rPr>
-                <w:sz w:val="20"/>
-              </w:rPr>
-            </w:r>
-            <w:r>
-              <w:rPr>
-                <w:sz w:val="20"/>
-              </w:rPr>
-            </w:r>
-            <w:r>
-              <w:rPr>
-                <w:sz w:val="20"/>
-              </w:rPr>
+                <w:lang w:val="en-US"/>
+              </w:rPr>
+            </w:pPr>
+            <w:proofErr w:type="gramStart"/>
+            <w:r>
+              <w:rPr>
+                <w:sz w:val="20"/>
+                <w:lang w:val="en-US"/>
+              </w:rPr>
+              <w:t xml:space="preserve">{{ </w:t>
+            </w:r>
+            <w:proofErr w:type="spellStart"/>
+            <w:r>
+              <w:rPr>
+                <w:sz w:val="20"/>
+                <w:lang w:val="en-US"/>
+              </w:rPr>
+              <w:t>applicant</w:t>
+            </w:r>
+            <w:proofErr w:type="gramEnd"/>
+            <w:r>
+              <w:rPr>
+                <w:sz w:val="20"/>
+                <w:lang w:val="en-US"/>
+              </w:rPr>
+              <w:t>.bank_name</w:t>
+            </w:r>
+            <w:proofErr w:type="spellEnd"/>
+            <w:r>
+              <w:rPr>
+                <w:sz w:val="20"/>
+                <w:lang w:val="en-US"/>
+              </w:rPr>
+              <w:t xml:space="preserve"> }}</w:t>
             </w:r>
           </w:p>
         </w:tc>
@@ -462,12 +537,6 @@
                 <w:sz w:val="20"/>
               </w:rPr>
               <w:t>{{ applicant.bank_bic }}</w:t>
-            </w:r>
-            <w:r>
-              <w:rPr>
-                <w:spacing w:val="-2"/>
-                <w:sz w:val="20"/>
-              </w:rPr>
             </w:r>
           </w:p>
         </w:tc>
@@ -548,11 +617,6 @@
                 <w:sz w:val="20"/>
               </w:rPr>
               <w:t xml:space="preserve"> {{ applicant.bank_correspondent_account }}</w:t>
-            </w:r>
-            <w:r>
-              <w:rPr>
-                <w:sz w:val="20"/>
-              </w:rPr>
             </w:r>
           </w:p>
         </w:tc>
@@ -578,23 +642,83 @@
     <w:p>
       <w:pPr>
         <w:pStyle w:val="a4"/>
+        <w:rPr>
+          <w:lang w:val="en-US"/>
+        </w:rPr>
       </w:pPr>
       <w:r>
-        <w:t>Счет № {{ invoice.sequence_number }} от {{ fmt_date_human_ru(invoice.document_date) }}</w:t>
-      </w:r>
-      <w:r/>
-      <w:r/>
-      <w:r/>
-      <w:r/>
-      <w:r/>
-      <w:r/>
-      <w:r/>
-      <w:r/>
-      <w:r/>
-      <w:r>
-        <w:rPr>
-          <w:spacing w:val="-4"/>
-        </w:rPr>
+        <w:t>Счет</w:t>
+      </w:r>
+      <w:r>
+        <w:rPr>
+          <w:lang w:val="en-US"/>
+        </w:rPr>
+        <w:t xml:space="preserve"> №</w:t>
+      </w:r>
+      <w:bookmarkStart w:id="0" w:name="_GoBack"/>
+      <w:bookmarkEnd w:id="0"/>
+      <w:r>
+        <w:rPr>
+          <w:lang w:val="en-US"/>
+        </w:rPr>
+        <w:t xml:space="preserve"> {{ </w:t>
+      </w:r>
+      <w:proofErr w:type="spellStart"/>
+      <w:r>
+        <w:rPr>
+          <w:lang w:val="en-US"/>
+        </w:rPr>
+        <w:t>invoice.seq_</w:t>
+      </w:r>
+      <w:r>
+        <w:rPr>
+          <w:lang w:val="en-US"/>
+        </w:rPr>
+        <w:t>with_year</w:t>
+      </w:r>
+      <w:proofErr w:type="spellEnd"/>
+      <w:r>
+        <w:rPr>
+          <w:lang w:val="en-US"/>
+        </w:rPr>
+        <w:t xml:space="preserve"> }} </w:t>
+      </w:r>
+      <w:r>
+        <w:t>от</w:t>
+      </w:r>
+      <w:r>
+        <w:rPr>
+          <w:lang w:val="en-US"/>
+        </w:rPr>
+        <w:t xml:space="preserve"> {{ </w:t>
+      </w:r>
+      <w:proofErr w:type="spellStart"/>
+      <w:r>
+        <w:rPr>
+          <w:lang w:val="en-US"/>
+        </w:rPr>
+        <w:t>fmt_date_human_ru</w:t>
+      </w:r>
+      <w:proofErr w:type="spellEnd"/>
+      <w:r>
+        <w:rPr>
+          <w:lang w:val="en-US"/>
+        </w:rPr>
+        <w:t>(</w:t>
+      </w:r>
+      <w:proofErr w:type="spellStart"/>
+      <w:r>
+        <w:rPr>
+          <w:lang w:val="en-US"/>
+        </w:rPr>
+        <w:t>invoice.document_date</w:t>
+      </w:r>
+      <w:proofErr w:type="spellEnd"/>
+      <w:r>
+        <w:rPr>
+          <w:lang w:val="en-US"/>
+        </w:rPr>
+        <w:t>) }}</w:t>
       </w:r>
     </w:p>
     <w:p>
@@ -608,6 +732,7 @@
         <w:rPr>
           <w:color w:val="666666"/>
           <w:spacing w:val="-2"/>
+          <w:lang w:val="en-US"/>
         </w:rPr>
       </w:pPr>
     </w:p>
@@ -619,6 +744,9 @@
         </w:tabs>
         <w:spacing w:before="27" w:line="241" w:lineRule="exact"/>
         <w:ind w:left="123"/>
+        <w:rPr>
+          <w:lang w:val="en-US"/>
+        </w:rPr>
       </w:pPr>
       <w:r>
         <w:rPr>
@@ -626,15 +754,117 @@
           <w:spacing w:val="-2"/>
         </w:rPr>
         <w:t>Плательщик</w:t>
+      </w:r>
+      <w:r>
+        <w:rPr>
+          <w:color w:val="666666"/>
+          <w:spacing w:val="-2"/>
+          <w:lang w:val="en-US"/>
+        </w:rPr>
         <w:tab/>
-        <w:t>{{ company.short_name }}, ИНН {{ company.tax_id_primary }}, КПП {{ company.tax_id_secondary }}</w:t>
-      </w:r>
+      </w:r>
+      <w:proofErr w:type="gramStart"/>
       <w:r>
         <w:rPr>
           <w:color w:val="666666"/>
-        </w:rPr>
-      </w:r>
-      <w:r/>
+          <w:spacing w:val="-2"/>
+          <w:lang w:val="en-US"/>
+        </w:rPr>
+        <w:t xml:space="preserve">{{ </w:t>
+      </w:r>
+      <w:proofErr w:type="spellStart"/>
+      <w:r>
+        <w:rPr>
+          <w:color w:val="666666"/>
+          <w:spacing w:val="-2"/>
+          <w:lang w:val="en-US"/>
+        </w:rPr>
+        <w:t>company</w:t>
+      </w:r>
+      <w:proofErr w:type="gramEnd"/>
+      <w:r>
+        <w:rPr>
+          <w:color w:val="666666"/>
+          <w:spacing w:val="-2"/>
+          <w:lang w:val="en-US"/>
+        </w:rPr>
+        <w:t>.short_name</w:t>
+      </w:r>
+      <w:proofErr w:type="spellEnd"/>
+      <w:r>
+        <w:rPr>
+          <w:color w:val="666666"/>
+          <w:spacing w:val="-2"/>
+          <w:lang w:val="en-US"/>
+        </w:rPr>
+        <w:t xml:space="preserve"> }}, </w:t>
+      </w:r>
+      <w:r>
+        <w:rPr>
+          <w:color w:val="666666"/>
+          <w:spacing w:val="-2"/>
+        </w:rPr>
+        <w:t>ИНН</w:t>
+      </w:r>
+      <w:r>
+        <w:rPr>
+          <w:color w:val="666666"/>
+          <w:spacing w:val="-2"/>
+          <w:lang w:val="en-US"/>
+        </w:rPr>
+        <w:t xml:space="preserve"> {{ </w:t>
+      </w:r>
+      <w:proofErr w:type="spellStart"/>
+      <w:r>
+        <w:rPr>
+          <w:color w:val="666666"/>
+          <w:spacing w:val="-2"/>
+          <w:lang w:val="en-US"/>
+        </w:rPr>
+        <w:t>company.tax_id_primary</w:t>
+      </w:r>
+      <w:proofErr w:type="spellEnd"/>
+      <w:r>
+        <w:rPr>
+          <w:color w:val="666666"/>
+          <w:spacing w:val="-2"/>
+          <w:lang w:val="en-US"/>
+        </w:rPr>
+        <w:t xml:space="preserve"> }}, </w:t>
+      </w:r>
+      <w:r>
+        <w:rPr>
+          <w:color w:val="666666"/>
+          <w:spacing w:val="-2"/>
+        </w:rPr>
+        <w:t>КПП</w:t>
+      </w:r>
+      <w:r>
+        <w:rPr>
+          <w:color w:val="666666"/>
+          <w:spacing w:val="-2"/>
+          <w:lang w:val="en-US"/>
+        </w:rPr>
+        <w:t xml:space="preserve"> {{ </w:t>
+      </w:r>
+      <w:proofErr w:type="spellStart"/>
+      <w:r>
+        <w:rPr>
+          <w:color w:val="666666"/>
+          <w:spacing w:val="-2"/>
+          <w:lang w:val="en-US"/>
+        </w:rPr>
+        <w:t>company.tax_id_secondary</w:t>
+      </w:r>
+      <w:proofErr w:type="spellEnd"/>
+      <w:r>
+        <w:rPr>
+          <w:color w:val="666666"/>
+          <w:spacing w:val="-2"/>
+          <w:lang w:val="en-US"/>
+        </w:rPr>
+        <w:t xml:space="preserve"> }}</w:t>
+      </w:r>
     </w:p>
     <w:p>
       <w:pPr>
@@ -649,21 +879,27 @@
         </w:rPr>
       </w:pPr>
       <w:r>
-        <w:t xml:space="preserve">                               {{ company.legal_address }}</w:t>
-      </w:r>
-      <w:r/>
+        <w:rPr>
+          <w:lang w:val="en-US"/>
+        </w:rPr>
+        <w:t xml:space="preserve">                               </w:t>
+      </w:r>
+      <w:proofErr w:type="gramStart"/>
+      <w:r>
+        <w:t xml:space="preserve">{{ </w:t>
+      </w:r>
       <w:proofErr w:type="spellStart"/>
-      <w:r/>
+      <w:r>
+        <w:t>company</w:t>
+      </w:r>
+      <w:proofErr w:type="gramEnd"/>
+      <w:r>
+        <w:t>.legal_address</w:t>
+      </w:r>
       <w:proofErr w:type="spellEnd"/>
-      <w:r/>
-      <w:proofErr w:type="gramStart"/>
-      <w:r/>
-      <w:proofErr w:type="gramEnd"/>
-      <w:r/>
-      <w:proofErr w:type="spellStart"/>
-      <w:r/>
-      <w:proofErr w:type="spellEnd"/>
-      <w:r/>
+      <w:r>
+        <w:t xml:space="preserve"> }}</w:t>
+      </w:r>
     </w:p>
     <w:p>
       <w:pPr>
@@ -902,160 +1138,41 @@
               <w:rPr>
                 <w:sz w:val="20"/>
               </w:rPr>
-              <w:t>Услуги {{ position.title_ru_genitive }} за период {{ fmt_date_ru(invoice.period_start) }}-{{ fmt_date_ru(invoice.period_end) }} по Договору №{{ contract.number }} от {{ fmt_date_ru(contract.sign_date) }}г.</w:t>
-            </w:r>
-            <w:r/>
-            <w:r>
-              <w:rPr>
-                <w:sz w:val="20"/>
-              </w:rPr>
-            </w:r>
-            <w:r>
-              <w:rPr>
-                <w:sz w:val="20"/>
-              </w:rPr>
-            </w:r>
-            <w:r>
-              <w:rPr>
-                <w:sz w:val="20"/>
-              </w:rPr>
+              <w:t>Услуги {{ position.title_ru_genitive }} за период {{ fmt_date_ru(invoice.period_start)</w:t>
+            </w:r>
+            <w:r>
+              <w:rPr>
+                <w:sz w:val="20"/>
+              </w:rPr>
+              <w:t xml:space="preserve"> }}-{{ fmt_date_ru(invoice.period_end) }} по Договору №{{ contract.number }} от {{ </w:t>
             </w:r>
             <w:proofErr w:type="spellStart"/>
             <w:r>
               <w:rPr>
                 <w:sz w:val="20"/>
               </w:rPr>
+              <w:t>fmt_date_ru</w:t>
             </w:r>
             <w:proofErr w:type="spellEnd"/>
             <w:r>
               <w:rPr>
                 <w:sz w:val="20"/>
               </w:rPr>
-            </w:r>
-            <w:r>
-              <w:rPr>
-                <w:sz w:val="20"/>
-              </w:rPr>
-            </w:r>
-            <w:r>
-              <w:rPr>
-                <w:sz w:val="20"/>
-              </w:rPr>
-            </w:r>
-            <w:r>
-              <w:rPr>
-                <w:sz w:val="20"/>
-              </w:rPr>
-            </w:r>
-            <w:r>
-              <w:rPr>
-                <w:sz w:val="20"/>
-              </w:rPr>
-            </w:r>
-            <w:r>
-              <w:rPr>
-                <w:sz w:val="20"/>
-              </w:rPr>
-            </w:r>
-            <w:r>
-              <w:rPr>
-                <w:sz w:val="20"/>
-              </w:rPr>
-            </w:r>
-            <w:r>
-              <w:rPr>
-                <w:sz w:val="20"/>
-              </w:rPr>
-            </w:r>
-            <w:r>
-              <w:rPr>
-                <w:sz w:val="20"/>
-              </w:rPr>
-            </w:r>
-            <w:r>
-              <w:rPr>
-                <w:sz w:val="20"/>
-              </w:rPr>
-            </w:r>
-            <w:r>
-              <w:rPr>
-                <w:sz w:val="20"/>
-              </w:rPr>
-            </w:r>
-            <w:r>
-              <w:rPr>
-                <w:sz w:val="20"/>
-              </w:rPr>
-            </w:r>
-            <w:r>
-              <w:rPr>
-                <w:sz w:val="20"/>
-              </w:rPr>
-            </w:r>
-            <w:r>
-              <w:rPr>
-                <w:sz w:val="20"/>
-              </w:rPr>
-            </w:r>
-            <w:r>
-              <w:rPr>
-                <w:sz w:val="20"/>
-              </w:rPr>
-            </w:r>
-            <w:r>
-              <w:rPr>
-                <w:sz w:val="20"/>
-              </w:rPr>
-            </w:r>
-            <w:r>
-              <w:rPr>
-                <w:sz w:val="20"/>
-              </w:rPr>
-            </w:r>
-            <w:r>
-              <w:rPr>
-                <w:sz w:val="20"/>
-              </w:rPr>
-            </w:r>
-            <w:r>
-              <w:rPr>
-                <w:sz w:val="20"/>
-              </w:rPr>
-            </w:r>
-            <w:r>
-              <w:rPr>
-                <w:sz w:val="20"/>
-              </w:rPr>
-            </w:r>
-            <w:r>
-              <w:rPr>
-                <w:spacing w:val="-2"/>
-                <w:sz w:val="20"/>
-              </w:rPr>
-            </w:r>
-            <w:r>
-              <w:rPr>
-                <w:spacing w:val="-2"/>
-                <w:sz w:val="20"/>
-              </w:rPr>
-            </w:r>
-            <w:r>
-              <w:rPr>
-                <w:spacing w:val="-2"/>
-                <w:sz w:val="20"/>
-              </w:rPr>
-            </w:r>
-            <w:r>
-              <w:rPr>
-                <w:spacing w:val="-2"/>
-                <w:sz w:val="20"/>
-              </w:rPr>
-            </w:r>
-            <w:r>
-              <w:rPr>
-                <w:spacing w:val="-2"/>
-                <w:sz w:val="20"/>
-              </w:rPr>
+              <w:t>(</w:t>
+            </w:r>
+            <w:proofErr w:type="spellStart"/>
+            <w:r>
+              <w:rPr>
+                <w:sz w:val="20"/>
+              </w:rPr>
+              <w:t>contract.sign_date</w:t>
+            </w:r>
+            <w:proofErr w:type="spellEnd"/>
+            <w:r>
+              <w:rPr>
+                <w:sz w:val="20"/>
+              </w:rPr>
+              <w:t>) }}г.</w:t>
             </w:r>
           </w:p>
         </w:tc>
@@ -1123,13 +1240,56 @@
               <w:jc w:val="right"/>
               <w:rPr>
                 <w:sz w:val="20"/>
-              </w:rPr>
-            </w:pPr>
-            <w:r>
-              <w:rPr>
-                <w:sz w:val="20"/>
-              </w:rPr>
-              <w:t>{{ fmt_money(invoice.salary_rub) }}</w:t>
+                <w:lang w:val="en-US"/>
+              </w:rPr>
+            </w:pPr>
+            <w:proofErr w:type="gramStart"/>
+            <w:r>
+              <w:rPr>
+                <w:sz w:val="20"/>
+                <w:lang w:val="en-US"/>
+              </w:rPr>
+              <w:t xml:space="preserve">{{ </w:t>
+            </w:r>
+            <w:proofErr w:type="spellStart"/>
+            <w:r>
+              <w:rPr>
+                <w:sz w:val="20"/>
+                <w:lang w:val="en-US"/>
+              </w:rPr>
+              <w:t>fmt</w:t>
+            </w:r>
+            <w:proofErr w:type="gramEnd"/>
+            <w:r>
+              <w:rPr>
+                <w:sz w:val="20"/>
+                <w:lang w:val="en-US"/>
+              </w:rPr>
+              <w:t>_money</w:t>
+            </w:r>
+            <w:proofErr w:type="spellEnd"/>
+            <w:r>
+              <w:rPr>
+                <w:sz w:val="20"/>
+                <w:lang w:val="en-US"/>
+              </w:rPr>
+              <w:t>(</w:t>
+            </w:r>
+            <w:proofErr w:type="spellStart"/>
+            <w:r>
+              <w:rPr>
+                <w:sz w:val="20"/>
+                <w:lang w:val="en-US"/>
+              </w:rPr>
+              <w:t>invoice.salary_rub</w:t>
+            </w:r>
+            <w:proofErr w:type="spellEnd"/>
+            <w:r>
+              <w:rPr>
+                <w:sz w:val="20"/>
+                <w:lang w:val="en-US"/>
+              </w:rPr>
+              <w:t>) }}</w:t>
             </w:r>
           </w:p>
         </w:tc>
@@ -1148,29 +1308,56 @@
               <w:jc w:val="right"/>
               <w:rPr>
                 <w:sz w:val="20"/>
-              </w:rPr>
-            </w:pPr>
-            <w:r>
-              <w:rPr>
-                <w:sz w:val="20"/>
-              </w:rPr>
-              <w:t>{{ fmt_money(invoice.salary_rub) }}</w:t>
-            </w:r>
-            <w:r>
-              <w:rPr>
-                <w:sz w:val="20"/>
-              </w:rPr>
-            </w:r>
-            <w:r>
-              <w:rPr>
-                <w:sz w:val="20"/>
-              </w:rPr>
-            </w:r>
-            <w:r>
-              <w:rPr>
-                <w:spacing w:val="-5"/>
-                <w:sz w:val="20"/>
-              </w:rPr>
+                <w:lang w:val="en-US"/>
+              </w:rPr>
+            </w:pPr>
+            <w:proofErr w:type="gramStart"/>
+            <w:r>
+              <w:rPr>
+                <w:sz w:val="20"/>
+                <w:lang w:val="en-US"/>
+              </w:rPr>
+              <w:t xml:space="preserve">{{ </w:t>
+            </w:r>
+            <w:proofErr w:type="spellStart"/>
+            <w:r>
+              <w:rPr>
+                <w:sz w:val="20"/>
+                <w:lang w:val="en-US"/>
+              </w:rPr>
+              <w:t>fmt</w:t>
+            </w:r>
+            <w:proofErr w:type="gramEnd"/>
+            <w:r>
+              <w:rPr>
+                <w:sz w:val="20"/>
+                <w:lang w:val="en-US"/>
+              </w:rPr>
+              <w:t>_money</w:t>
+            </w:r>
+            <w:proofErr w:type="spellEnd"/>
+            <w:r>
+              <w:rPr>
+                <w:sz w:val="20"/>
+                <w:lang w:val="en-US"/>
+              </w:rPr>
+              <w:t>(</w:t>
+            </w:r>
+            <w:proofErr w:type="spellStart"/>
+            <w:r>
+              <w:rPr>
+                <w:sz w:val="20"/>
+                <w:lang w:val="en-US"/>
+              </w:rPr>
+              <w:t>invoice.salary_rub</w:t>
+            </w:r>
+            <w:proofErr w:type="spellEnd"/>
+            <w:r>
+              <w:rPr>
+                <w:sz w:val="20"/>
+                <w:lang w:val="en-US"/>
+              </w:rPr>
+              <w:t>) }}</w:t>
             </w:r>
           </w:p>
         </w:tc>
@@ -1205,21 +1392,20 @@
                 <w:spacing w:val="-2"/>
                 <w:sz w:val="20"/>
               </w:rPr>
-              <w:t>Итого</w:t>
+              <w:t xml:space="preserve">Итого </w:t>
+            </w:r>
+            <w:r>
+              <w:rPr>
+                <w:sz w:val="20"/>
+              </w:rPr>
+              <w:t>Без</w:t>
             </w:r>
             <w:proofErr w:type="gramEnd"/>
             <w:r>
               <w:rPr>
-                <w:spacing w:val="-2"/>
-                <w:sz w:val="20"/>
-              </w:rPr>
-              <w:t xml:space="preserve"> </w:t>
-            </w:r>
-            <w:r>
-              <w:rPr>
-                <w:sz w:val="20"/>
-              </w:rPr>
-              <w:t xml:space="preserve">Без налога </w:t>
+                <w:sz w:val="20"/>
+              </w:rPr>
+              <w:t xml:space="preserve"> налога </w:t>
             </w:r>
             <w:r>
               <w:rPr>
@@ -1269,29 +1455,56 @@
               <w:jc w:val="right"/>
               <w:rPr>
                 <w:sz w:val="20"/>
-              </w:rPr>
-            </w:pPr>
-            <w:r>
-              <w:rPr>
-                <w:sz w:val="20"/>
-              </w:rPr>
-              <w:t>{{ fmt_money(invoice.salary_rub) }}</w:t>
-            </w:r>
-            <w:r>
-              <w:rPr>
-                <w:sz w:val="20"/>
-              </w:rPr>
-            </w:r>
-            <w:r>
-              <w:rPr>
-                <w:sz w:val="20"/>
-              </w:rPr>
-            </w:r>
-            <w:r>
-              <w:rPr>
-                <w:spacing w:val="-5"/>
-                <w:sz w:val="20"/>
-              </w:rPr>
+                <w:lang w:val="en-US"/>
+              </w:rPr>
+            </w:pPr>
+            <w:proofErr w:type="gramStart"/>
+            <w:r>
+              <w:rPr>
+                <w:sz w:val="20"/>
+                <w:lang w:val="en-US"/>
+              </w:rPr>
+              <w:t xml:space="preserve">{{ </w:t>
+            </w:r>
+            <w:proofErr w:type="spellStart"/>
+            <w:r>
+              <w:rPr>
+                <w:sz w:val="20"/>
+                <w:lang w:val="en-US"/>
+              </w:rPr>
+              <w:t>fmt</w:t>
+            </w:r>
+            <w:proofErr w:type="gramEnd"/>
+            <w:r>
+              <w:rPr>
+                <w:sz w:val="20"/>
+                <w:lang w:val="en-US"/>
+              </w:rPr>
+              <w:t>_money</w:t>
+            </w:r>
+            <w:proofErr w:type="spellEnd"/>
+            <w:r>
+              <w:rPr>
+                <w:sz w:val="20"/>
+                <w:lang w:val="en-US"/>
+              </w:rPr>
+              <w:t>(</w:t>
+            </w:r>
+            <w:proofErr w:type="spellStart"/>
+            <w:r>
+              <w:rPr>
+                <w:sz w:val="20"/>
+                <w:lang w:val="en-US"/>
+              </w:rPr>
+              <w:t>invoice.salary_rub</w:t>
+            </w:r>
+            <w:proofErr w:type="spellEnd"/>
+            <w:r>
+              <w:rPr>
+                <w:sz w:val="20"/>
+                <w:lang w:val="en-US"/>
+              </w:rPr>
+              <w:t>) }}</w:t>
             </w:r>
           </w:p>
         </w:tc>
@@ -1316,6 +1529,7 @@
               <w:rPr>
                 <w:sz w:val="2"/>
                 <w:szCs w:val="2"/>
+                <w:lang w:val="en-US"/>
               </w:rPr>
             </w:pPr>
           </w:p>
@@ -1381,33 +1595,62 @@
               <w:rPr>
                 <w:b/>
                 <w:sz w:val="20"/>
-              </w:rPr>
-            </w:pPr>
+                <w:lang w:val="en-US"/>
+              </w:rPr>
+            </w:pPr>
+            <w:proofErr w:type="gramStart"/>
             <w:r>
               <w:rPr>
                 <w:b/>
                 <w:sz w:val="20"/>
-              </w:rPr>
-              <w:t>{{ fmt_money(invoice.salary_rub) }}</w:t>
-            </w:r>
+                <w:lang w:val="en-US"/>
+              </w:rPr>
+              <w:t xml:space="preserve">{{ </w:t>
+            </w:r>
+            <w:proofErr w:type="spellStart"/>
             <w:r>
               <w:rPr>
                 <w:b/>
                 <w:sz w:val="20"/>
-              </w:rPr>
-            </w:r>
+                <w:lang w:val="en-US"/>
+              </w:rPr>
+              <w:t>fmt</w:t>
+            </w:r>
+            <w:proofErr w:type="gramEnd"/>
             <w:r>
               <w:rPr>
                 <w:b/>
                 <w:sz w:val="20"/>
-              </w:rPr>
-            </w:r>
+                <w:lang w:val="en-US"/>
+              </w:rPr>
+              <w:t>_money</w:t>
+            </w:r>
+            <w:proofErr w:type="spellEnd"/>
             <w:r>
               <w:rPr>
                 <w:b/>
-                <w:spacing w:val="-5"/>
-                <w:sz w:val="20"/>
-              </w:rPr>
+                <w:sz w:val="20"/>
+                <w:lang w:val="en-US"/>
+              </w:rPr>
+              <w:t>(</w:t>
+            </w:r>
+            <w:proofErr w:type="spellStart"/>
+            <w:r>
+              <w:rPr>
+                <w:b/>
+                <w:sz w:val="20"/>
+                <w:lang w:val="en-US"/>
+              </w:rPr>
+              <w:t>invoice.salary_rub</w:t>
+            </w:r>
+            <w:proofErr w:type="spellEnd"/>
+            <w:r>
+              <w:rPr>
+                <w:b/>
+                <w:sz w:val="20"/>
+                <w:lang w:val="en-US"/>
+              </w:rPr>
+              <w:t>) }}</w:t>
             </w:r>
           </w:p>
         </w:tc>
@@ -1416,24 +1659,36 @@
     <w:p>
       <w:pPr>
         <w:pStyle w:val="a3"/>
+        <w:rPr>
+          <w:lang w:val="en-US"/>
+        </w:rPr>
       </w:pPr>
     </w:p>
     <w:p>
       <w:pPr>
         <w:pStyle w:val="a3"/>
         <w:spacing w:before="192"/>
+        <w:rPr>
+          <w:lang w:val="en-US"/>
+        </w:rPr>
       </w:pPr>
     </w:p>
     <w:p>
       <w:pPr>
         <w:pStyle w:val="a3"/>
         <w:spacing w:before="192"/>
+        <w:rPr>
+          <w:lang w:val="en-US"/>
+        </w:rPr>
       </w:pPr>
     </w:p>
     <w:p>
       <w:pPr>
         <w:pStyle w:val="a3"/>
         <w:spacing w:before="192"/>
+        <w:rPr>
+          <w:lang w:val="en-US"/>
+        </w:rPr>
       </w:pPr>
     </w:p>
     <w:p>
@@ -1443,37 +1698,64 @@
         <w:ind w:left="83"/>
       </w:pPr>
       <w:r>
-        <w:t>Всего одно наименование на сумму {{ fmt_money(invoice.salary_rub) }} руб.</w:t>
-      </w:r>
-      <w:r/>
-      <w:r/>
-      <w:r/>
-      <w:r>
-        <w:rPr>
-          <w:spacing w:val="-4"/>
-        </w:rPr>
+        <w:t xml:space="preserve">Всего одно наименование на сумму </w:t>
+      </w:r>
+      <w:proofErr w:type="gramStart"/>
+      <w:r>
+        <w:t>{{ fmt</w:t>
+      </w:r>
+      <w:proofErr w:type="gramEnd"/>
+      <w:r>
+        <w:t>_money(invoice.salary_rub) }} руб.</w:t>
       </w:r>
     </w:p>
     <w:p>
       <w:pPr>
         <w:pStyle w:val="1"/>
         <w:ind w:left="83"/>
+        <w:rPr>
+          <w:lang w:val="en-US"/>
+        </w:rPr>
       </w:pPr>
-      <w:r>
-        <w:t>{{ contract.salary_rub_words|capitalize }} рублей 00 копеек</w:t>
-      </w:r>
-      <w:r/>
-      <w:r/>
-      <w:r>
-        <w:rPr>
-          <w:spacing w:val="58"/>
-        </w:rPr>
-      </w:r>
-      <w:r/>
-      <w:r>
-        <w:rPr>
-          <w:spacing w:val="-2"/>
-        </w:rPr>
+      <w:proofErr w:type="gramStart"/>
+      <w:r>
+        <w:rPr>
+          <w:lang w:val="en-US"/>
+        </w:rPr>
+        <w:t xml:space="preserve">{{ </w:t>
+      </w:r>
+      <w:proofErr w:type="spellStart"/>
+      <w:r>
+        <w:rPr>
+          <w:lang w:val="en-US"/>
+        </w:rPr>
+        <w:t>contract</w:t>
+      </w:r>
+      <w:proofErr w:type="gramEnd"/>
+      <w:r>
+        <w:rPr>
+          <w:lang w:val="en-US"/>
+        </w:rPr>
+        <w:t>.salary_rub_words|capitalize</w:t>
+      </w:r>
+      <w:proofErr w:type="spellEnd"/>
+      <w:r>
+        <w:rPr>
+          <w:lang w:val="en-US"/>
+        </w:rPr>
+        <w:t xml:space="preserve"> }} </w:t>
+      </w:r>
+      <w:r>
+        <w:t>рублей</w:t>
+      </w:r>
+      <w:r>
+        <w:rPr>
+          <w:lang w:val="en-US"/>
+        </w:rPr>
+        <w:t xml:space="preserve"> 00 </w:t>
+      </w:r>
+      <w:r>
+        <w:t>копеек</w:t>
       </w:r>
     </w:p>
     <w:p>
@@ -1481,6 +1763,7 @@
         <w:pStyle w:val="a3"/>
         <w:rPr>
           <w:b/>
+          <w:lang w:val="en-US"/>
         </w:rPr>
       </w:pPr>
     </w:p>
@@ -1490,6 +1773,7 @@
         <w:spacing w:before="65"/>
         <w:rPr>
           <w:b/>
+          <w:lang w:val="en-US"/>
         </w:rPr>
       </w:pPr>
     </w:p>
@@ -1506,15 +1790,36 @@
         <w:rPr>
           <w:u w:val="single"/>
         </w:rPr>
-        <w:t>__________________ {{ applicant.initials_native }}</w:t>
-      </w:r>
-      <w:r>
-        <w:rPr>
-          <w:spacing w:val="-19"/>
-        </w:rPr>
-      </w:r>
-      <w:r/>
-      <w:r/>
+        <w:t xml:space="preserve">__________________ </w:t>
+      </w:r>
+      <w:proofErr w:type="gramStart"/>
+      <w:r>
+        <w:rPr>
+          <w:u w:val="single"/>
+        </w:rPr>
+        <w:t xml:space="preserve">{{ </w:t>
+      </w:r>
+      <w:proofErr w:type="spellStart"/>
+      <w:r>
+        <w:rPr>
+          <w:u w:val="single"/>
+        </w:rPr>
+        <w:t>applicant</w:t>
+      </w:r>
+      <w:proofErr w:type="gramEnd"/>
+      <w:r>
+        <w:rPr>
+          <w:u w:val="single"/>
+        </w:rPr>
+        <w:t>.initials_native</w:t>
+      </w:r>
+      <w:proofErr w:type="spellEnd"/>
+      <w:r>
+        <w:rPr>
+          <w:u w:val="single"/>
+        </w:rPr>
+        <w:t xml:space="preserve"> }}</w:t>
+      </w:r>
     </w:p>
     <w:sectPr>
       <w:type w:val="continuous"/>
@@ -1527,7 +1832,7 @@
 </file>
 
 <file path=word/styles.xml><?xml version="1.0" encoding="utf-8"?>
-<w:styles xmlns:mc="http://schemas.openxmlformats.org/markup-compatibility/2006" xmlns:r="http://schemas.openxmlformats.org/officeDocument/2006/relationships" xmlns:w="http://schemas.openxmlformats.org/wordprocessingml/2006/main" xmlns:w14="http://schemas.microsoft.com/office/word/2010/wordml" xmlns:w15="http://schemas.microsoft.com/office/word/2012/wordml" xmlns:w16cex="http://schemas.microsoft.com/office/word/2018/wordml/cex" xmlns:w16cid="http://schemas.microsoft.com/office/word/2016/wordml/cid" xmlns:w16="http://schemas.microsoft.com/office/word/2018/wordml" xmlns:w16du="http://schemas.microsoft.com/office/word/2023/wordml/word16du" xmlns:w16sdtdh="http://schemas.microsoft.com/office/word/2020/wordml/sdtdatahash" xmlns:w16sdtfl="http://schemas.microsoft.com/office/word/2024/wordml/sdtformatlock" xmlns:w16se="http://schemas.microsoft.com/office/word/2015/wordml/symex" mc:Ignorable="w14 w15 w16se w16cid w16 w16cex w16sdtdh w16sdtfl w16du">
+<w:styles xmlns:mc="http://schemas.openxmlformats.org/markup-compatibility/2006" xmlns:r="http://schemas.openxmlformats.org/officeDocument/2006/relationships" xmlns:w="http://schemas.openxmlformats.org/wordprocessingml/2006/main" xmlns:w14="http://schemas.microsoft.com/office/word/2010/wordml" xmlns:w15="http://schemas.microsoft.com/office/word/2012/wordml" xmlns:w16cid="http://schemas.microsoft.com/office/word/2016/wordml/cid" xmlns:w16se="http://schemas.microsoft.com/office/word/2015/wordml/symex" mc:Ignorable="w14 w15 w16se w16cid">
   <w:docDefaults>
     <w:rPrDefault>
       <w:rPr>
@@ -1545,7 +1850,7 @@
       </w:pPr>
     </w:pPrDefault>
   </w:docDefaults>
-  <w:latentStyles w:defLockedState="0" w:defUIPriority="99" w:defSemiHidden="0" w:defUnhideWhenUsed="0" w:defQFormat="0" w:count="376">
+  <w:latentStyles w:defLockedState="0" w:defUIPriority="99" w:defSemiHidden="0" w:defUnhideWhenUsed="0" w:defQFormat="0" w:count="375">
     <w:lsdException w:name="Normal" w:uiPriority="0" w:qFormat="1"/>
     <w:lsdException w:name="heading 1" w:uiPriority="9" w:qFormat="1"/>
     <w:lsdException w:name="heading 2" w:semiHidden="1" w:uiPriority="9" w:unhideWhenUsed="1" w:qFormat="1"/>
@@ -1921,7 +2226,6 @@
     <w:lsdException w:name="Smart Hyperlink" w:semiHidden="1" w:unhideWhenUsed="1"/>
     <w:lsdException w:name="Hashtag" w:semiHidden="1" w:unhideWhenUsed="1"/>
     <w:lsdException w:name="Unresolved Mention" w:semiHidden="1" w:unhideWhenUsed="1"/>
-    <w:lsdException w:name="Smart Link" w:semiHidden="1" w:unhideWhenUsed="1"/>
   </w:latentStyles>
   <w:style w:type="paragraph" w:default="1" w:styleId="a">
     <w:name w:val="Normal"/>

</xml_diff>